<commit_message>
coding for first test case
</commit_message>
<xml_diff>
--- a/Test cases.docx
+++ b/Test cases.docx
@@ -1632,25 +1632,25 @@
                 <w:lang w:val="en-GB"/>
               </w:rPr>
             </w:pPr>
-            <w:proofErr w:type="gramStart"/>
-            <w:r>
-              <w:rPr>
-                <w:rFonts w:ascii="Times New Roman" w:eastAsia="Times New Roman" w:hAnsi="Times New Roman" w:cs="Times New Roman"/>
-                <w:sz w:val="24"/>
-                <w:szCs w:val="24"/>
-                <w:lang w:val="en-GB"/>
-              </w:rPr>
-              <w:t>click</w:t>
-            </w:r>
-            <w:proofErr w:type="gramEnd"/>
-            <w:r>
-              <w:rPr>
-                <w:rFonts w:ascii="Times New Roman" w:eastAsia="Times New Roman" w:hAnsi="Times New Roman" w:cs="Times New Roman"/>
-                <w:sz w:val="24"/>
-                <w:szCs w:val="24"/>
-                <w:lang w:val="en-GB"/>
-              </w:rPr>
-              <w:t xml:space="preserve"> each topic, then click the first article link inside that topic. </w:t>
+            <w:r>
+              <w:rPr>
+                <w:rFonts w:ascii="Times New Roman" w:eastAsia="Times New Roman" w:hAnsi="Times New Roman" w:cs="Times New Roman"/>
+                <w:sz w:val="24"/>
+                <w:szCs w:val="24"/>
+                <w:lang w:val="en-GB"/>
+              </w:rPr>
+              <w:t>C</w:t>
+            </w:r>
+            <w:bookmarkStart w:id="0" w:name="_GoBack"/>
+            <w:bookmarkEnd w:id="0"/>
+            <w:r>
+              <w:rPr>
+                <w:rFonts w:ascii="Times New Roman" w:eastAsia="Times New Roman" w:hAnsi="Times New Roman" w:cs="Times New Roman"/>
+                <w:sz w:val="24"/>
+                <w:szCs w:val="24"/>
+                <w:lang w:val="en-GB"/>
+              </w:rPr>
+              <w:t>lick each topic, then click the first article link inside that topic. </w:t>
             </w:r>
           </w:p>
         </w:tc>
@@ -2251,8 +2251,6 @@
           <w:szCs w:val="28"/>
         </w:rPr>
       </w:pPr>
-      <w:bookmarkStart w:id="0" w:name="_GoBack"/>
-      <w:bookmarkEnd w:id="0"/>
     </w:p>
     <w:sectPr>
       <w:pgSz w:w="12240" w:h="15840"/>

</xml_diff>